<commit_message>
AI Prompt edited following Test runs with Attack scenario not included in this project
</commit_message>
<xml_diff>
--- a/Applied-Research Project/06-LLM-Investigation/01_Prompts/AI_Prompt.docx
+++ b/Applied-Research Project/06-LLM-Investigation/01_Prompts/AI_Prompt.docx
@@ -5,6 +5,7 @@
     <w:p>
       <w:pPr>
         <w:rPr>
+          <w:rFonts w:ascii="Calibri" w:hAnsi="Calibri" w:cs="Calibri"/>
           <w:sz w:val="36"/>
           <w:szCs w:val="36"/>
           <w:u w:val="single"/>
@@ -12,6 +13,7 @@
       </w:pPr>
       <w:r>
         <w:rPr>
+          <w:rFonts w:ascii="Calibri" w:hAnsi="Calibri" w:cs="Calibri"/>
           <w:sz w:val="36"/>
           <w:szCs w:val="36"/>
           <w:u w:val="single"/>
@@ -19,103 +21,387 @@
         <w:t>Prompt Draft</w:t>
       </w:r>
     </w:p>
-    <w:p/>
-    <w:p>
-      <w:r>
+    <w:p>
+      <w:pPr>
+        <w:rPr>
+          <w:rFonts w:ascii="Calibri" w:hAnsi="Calibri" w:cs="Calibri"/>
+        </w:rPr>
+      </w:pPr>
+    </w:p>
+    <w:p>
+      <w:pPr>
+        <w:rPr>
+          <w:rFonts w:ascii="Calibri" w:hAnsi="Calibri" w:cs="Calibri"/>
+        </w:rPr>
+      </w:pPr>
+      <w:r>
+        <w:rPr>
+          <w:rFonts w:ascii="Calibri" w:hAnsi="Calibri" w:cs="Calibri"/>
+        </w:rPr>
         <w:t>You are acting as an autonomous Security Operations Centre incident investigator.</w:t>
       </w:r>
     </w:p>
     <w:p>
-      <w:r>
-        <w:t xml:space="preserve">You will be provided with raw Sysmon telemetry and </w:t>
-      </w:r>
-      <w:proofErr w:type="spellStart"/>
-      <w:r>
-        <w:t>Wazuh</w:t>
-      </w:r>
-      <w:proofErr w:type="spellEnd"/>
-      <w:r>
-        <w:t xml:space="preserve"> alerts relating to a security event.</w:t>
-      </w:r>
-    </w:p>
-    <w:p>
-      <w:r>
+      <w:pPr>
+        <w:rPr>
+          <w:rFonts w:ascii="Calibri" w:hAnsi="Calibri" w:cs="Calibri"/>
+        </w:rPr>
+      </w:pPr>
+      <w:r>
+        <w:rPr>
+          <w:rFonts w:ascii="Calibri" w:hAnsi="Calibri" w:cs="Calibri"/>
+        </w:rPr>
+        <w:t>You will be provided with Sysmon telemetry and Wazuh alerts, or Wazuh-collected logs containing Sysmon-related telemetry, from activity conducted within an isolated lab environment.</w:t>
+      </w:r>
+    </w:p>
+    <w:p>
+      <w:pPr>
+        <w:rPr>
+          <w:rFonts w:ascii="Calibri" w:hAnsi="Calibri" w:cs="Calibri"/>
+        </w:rPr>
+      </w:pPr>
+      <w:r>
+        <w:rPr>
+          <w:rFonts w:ascii="Calibri" w:hAnsi="Calibri" w:cs="Calibri"/>
+        </w:rPr>
         <w:t>Your task is to independently analyse the supplied evidence and produce a detailed incident investigation report explaining what occurred and the significance of the observed activity.</w:t>
       </w:r>
     </w:p>
     <w:p>
-      <w:r>
-        <w:t>You should determine the relevant findings from the evidence without additional guidance.</w:t>
-      </w:r>
-    </w:p>
-    <w:p>
-      <w:r>
+      <w:pPr>
+        <w:rPr>
+          <w:rFonts w:ascii="Calibri" w:hAnsi="Calibri" w:cs="Calibri"/>
+        </w:rPr>
+      </w:pPr>
+      <w:r>
+        <w:rPr>
+          <w:rFonts w:ascii="Calibri" w:hAnsi="Calibri" w:cs="Calibri"/>
+        </w:rPr>
+        <w:t>Determine the relevant findings, relationships, sequence of events</w:t>
+      </w:r>
+      <w:r>
+        <w:rPr>
+          <w:rFonts w:ascii="Calibri" w:hAnsi="Calibri" w:cs="Calibri"/>
+        </w:rPr>
+        <w:t xml:space="preserve"> </w:t>
+      </w:r>
+      <w:r>
+        <w:rPr>
+          <w:rFonts w:ascii="Calibri" w:hAnsi="Calibri" w:cs="Calibri"/>
+        </w:rPr>
+        <w:t>and overall significance from the supplied evidence without additional guidance.</w:t>
+      </w:r>
+    </w:p>
+    <w:p>
+      <w:pPr>
+        <w:rPr>
+          <w:rFonts w:ascii="Calibri" w:hAnsi="Calibri" w:cs="Calibri"/>
+        </w:rPr>
+      </w:pPr>
+      <w:r>
+        <w:rPr>
+          <w:rFonts w:ascii="Calibri" w:hAnsi="Calibri" w:cs="Calibri"/>
+        </w:rPr>
+        <w:t>Do not use outside knowledge of a named scenario, dataset or expected answer when determining what occurred.</w:t>
+      </w:r>
+    </w:p>
+    <w:p>
+      <w:pPr>
+        <w:rPr>
+          <w:rFonts w:ascii="Calibri" w:hAnsi="Calibri" w:cs="Calibri"/>
+          <w:b/>
+          <w:bCs/>
+        </w:rPr>
+      </w:pPr>
+      <w:r>
+        <w:rPr>
+          <w:rFonts w:ascii="Calibri" w:hAnsi="Calibri" w:cs="Calibri"/>
+          <w:b/>
+          <w:bCs/>
+        </w:rPr>
         <w:t>Required Report Structure</w:t>
       </w:r>
     </w:p>
     <w:p>
-      <w:r>
+      <w:pPr>
+        <w:rPr>
+          <w:rFonts w:ascii="Calibri" w:hAnsi="Calibri" w:cs="Calibri"/>
+          <w:u w:val="single"/>
+        </w:rPr>
+      </w:pPr>
+      <w:r>
+        <w:rPr>
+          <w:rFonts w:ascii="Calibri" w:hAnsi="Calibri" w:cs="Calibri"/>
+          <w:u w:val="single"/>
+        </w:rPr>
         <w:t>1. Executive Summary</w:t>
       </w:r>
     </w:p>
     <w:p>
-      <w:r>
+      <w:pPr>
+        <w:rPr>
+          <w:rFonts w:ascii="Calibri" w:hAnsi="Calibri" w:cs="Calibri"/>
+        </w:rPr>
+      </w:pPr>
+      <w:r>
+        <w:rPr>
+          <w:rFonts w:ascii="Calibri" w:hAnsi="Calibri" w:cs="Calibri"/>
+        </w:rPr>
         <w:t>Provide a concise overview of the main findings of the investigation.</w:t>
       </w:r>
     </w:p>
     <w:p>
-      <w:r>
-        <w:t>2. Detailed Investigation</w:t>
-      </w:r>
-    </w:p>
-    <w:p>
-      <w:r>
-        <w:t>Present your analysis of the activity and explain the findings you consider relevant.</w:t>
-      </w:r>
-    </w:p>
-    <w:p>
-      <w:r>
-        <w:t>3. Evidence Analysis</w:t>
-      </w:r>
-    </w:p>
-    <w:p>
-      <w:r>
-        <w:t>Identify and explain the evidence that supports your investigation findings.</w:t>
-      </w:r>
-    </w:p>
-    <w:p>
-      <w:r>
-        <w:t>4. Timeline of Events</w:t>
-      </w:r>
-    </w:p>
-    <w:p>
-      <w:r>
-        <w:t>Reconstruct the relevant sequence of events in chronological order.</w:t>
-      </w:r>
-    </w:p>
-    <w:p>
-      <w:r>
-        <w:t>5. Overall Investigation Conclusion</w:t>
-      </w:r>
-    </w:p>
-    <w:p>
-      <w:r>
-        <w:t>Summarise the findings of the investigation.</w:t>
-      </w:r>
-    </w:p>
-    <w:p>
-      <w:r>
-        <w:t>Investigation Requirements</w:t>
+      <w:pPr>
+        <w:rPr>
+          <w:rFonts w:ascii="Calibri" w:hAnsi="Calibri" w:cs="Calibri"/>
+          <w:u w:val="single"/>
+        </w:rPr>
+      </w:pPr>
+      <w:r>
+        <w:rPr>
+          <w:rFonts w:ascii="Calibri" w:hAnsi="Calibri" w:cs="Calibri"/>
+          <w:u w:val="single"/>
+        </w:rPr>
+        <w:t>2. Scope of Activity</w:t>
+      </w:r>
+    </w:p>
+    <w:p>
+      <w:pPr>
+        <w:rPr>
+          <w:rFonts w:ascii="Calibri" w:hAnsi="Calibri" w:cs="Calibri"/>
+        </w:rPr>
+      </w:pPr>
+      <w:r>
+        <w:rPr>
+          <w:rFonts w:ascii="Calibri" w:hAnsi="Calibri" w:cs="Calibri"/>
+        </w:rPr>
+        <w:t>Describe the extent and nature of the activity supported by the supplied evidence.</w:t>
+      </w:r>
+    </w:p>
+    <w:p>
+      <w:pPr>
+        <w:rPr>
+          <w:rFonts w:ascii="Calibri" w:hAnsi="Calibri" w:cs="Calibri"/>
+          <w:u w:val="single"/>
+        </w:rPr>
+      </w:pPr>
+      <w:r>
+        <w:rPr>
+          <w:rFonts w:ascii="Calibri" w:hAnsi="Calibri" w:cs="Calibri"/>
+          <w:u w:val="single"/>
+        </w:rPr>
+        <w:t>3. Detailed Investigation</w:t>
+      </w:r>
+    </w:p>
+    <w:p>
+      <w:pPr>
+        <w:rPr>
+          <w:rFonts w:ascii="Calibri" w:hAnsi="Calibri" w:cs="Calibri"/>
+        </w:rPr>
+      </w:pPr>
+      <w:r>
+        <w:rPr>
+          <w:rFonts w:ascii="Calibri" w:hAnsi="Calibri" w:cs="Calibri"/>
+        </w:rPr>
+        <w:t>Present your analysis of the observed activity and explain the findings you consider relevant.</w:t>
+      </w:r>
+    </w:p>
+    <w:p>
+      <w:pPr>
+        <w:rPr>
+          <w:rFonts w:ascii="Calibri" w:hAnsi="Calibri" w:cs="Calibri"/>
+        </w:rPr>
+      </w:pPr>
+      <w:r>
+        <w:rPr>
+          <w:rFonts w:ascii="Calibri" w:hAnsi="Calibri" w:cs="Calibri"/>
+        </w:rPr>
+        <w:t>Clearly distinguish between findings directly observed in the evidence and conclusions that are inferred from that evidence.</w:t>
+      </w:r>
+    </w:p>
+    <w:p>
+      <w:pPr>
+        <w:rPr>
+          <w:rFonts w:ascii="Calibri" w:hAnsi="Calibri" w:cs="Calibri"/>
+          <w:u w:val="single"/>
+        </w:rPr>
+      </w:pPr>
+      <w:r>
+        <w:rPr>
+          <w:rFonts w:ascii="Calibri" w:hAnsi="Calibri" w:cs="Calibri"/>
+          <w:u w:val="single"/>
+        </w:rPr>
+        <w:t>4. Evidence Analysis</w:t>
+      </w:r>
+    </w:p>
+    <w:p>
+      <w:pPr>
+        <w:rPr>
+          <w:rFonts w:ascii="Calibri" w:hAnsi="Calibri" w:cs="Calibri"/>
+        </w:rPr>
+      </w:pPr>
+      <w:r>
+        <w:rPr>
+          <w:rFonts w:ascii="Calibri" w:hAnsi="Calibri" w:cs="Calibri"/>
+        </w:rPr>
+        <w:t>Identify and explain the evidence supporting the investigation findings.</w:t>
+      </w:r>
+    </w:p>
+    <w:p>
+      <w:pPr>
+        <w:rPr>
+          <w:rFonts w:ascii="Calibri" w:hAnsi="Calibri" w:cs="Calibri"/>
+        </w:rPr>
+      </w:pPr>
+      <w:r>
+        <w:rPr>
+          <w:rFonts w:ascii="Calibri" w:hAnsi="Calibri" w:cs="Calibri"/>
+        </w:rPr>
+        <w:t>Reference the relevant records and values from the supplied telemetry where appropriate.</w:t>
+      </w:r>
+    </w:p>
+    <w:p>
+      <w:pPr>
+        <w:rPr>
+          <w:rFonts w:ascii="Calibri" w:hAnsi="Calibri" w:cs="Calibri"/>
+          <w:u w:val="single"/>
+        </w:rPr>
+      </w:pPr>
+      <w:r>
+        <w:rPr>
+          <w:rFonts w:ascii="Calibri" w:hAnsi="Calibri" w:cs="Calibri"/>
+          <w:u w:val="single"/>
+        </w:rPr>
+        <w:t>5. Timeline of Events</w:t>
+      </w:r>
+    </w:p>
+    <w:p>
+      <w:pPr>
+        <w:rPr>
+          <w:rFonts w:ascii="Calibri" w:hAnsi="Calibri" w:cs="Calibri"/>
+        </w:rPr>
+      </w:pPr>
+      <w:r>
+        <w:rPr>
+          <w:rFonts w:ascii="Calibri" w:hAnsi="Calibri" w:cs="Calibri"/>
+        </w:rPr>
+        <w:t>Reconstruct the relevant sequence of events in chronological order based on the available evidence.</w:t>
+      </w:r>
+    </w:p>
+    <w:p>
+      <w:pPr>
+        <w:rPr>
+          <w:rFonts w:ascii="Calibri" w:hAnsi="Calibri" w:cs="Calibri"/>
+          <w:u w:val="single"/>
+        </w:rPr>
+      </w:pPr>
+      <w:r>
+        <w:rPr>
+          <w:rFonts w:ascii="Calibri" w:hAnsi="Calibri" w:cs="Calibri"/>
+          <w:u w:val="single"/>
+        </w:rPr>
+        <w:t>6. MITRE ATT&amp;CK Mapping</w:t>
+      </w:r>
+    </w:p>
+    <w:p>
+      <w:pPr>
+        <w:rPr>
+          <w:rFonts w:ascii="Calibri" w:hAnsi="Calibri" w:cs="Calibri"/>
+        </w:rPr>
+      </w:pPr>
+      <w:r>
+        <w:rPr>
+          <w:rFonts w:ascii="Calibri" w:hAnsi="Calibri" w:cs="Calibri"/>
+        </w:rPr>
+        <w:t>Where supported by the supplied evidence, identify relevant MITRE ATT&amp;CK tactics and techniques.</w:t>
+      </w:r>
+    </w:p>
+    <w:p>
+      <w:pPr>
+        <w:rPr>
+          <w:rFonts w:ascii="Calibri" w:hAnsi="Calibri" w:cs="Calibri"/>
+        </w:rPr>
+      </w:pPr>
+      <w:r>
+        <w:rPr>
+          <w:rFonts w:ascii="Calibri" w:hAnsi="Calibri" w:cs="Calibri"/>
+        </w:rPr>
+        <w:lastRenderedPageBreak/>
+        <w:t>Explain the evidence supporting each mapping.</w:t>
+      </w:r>
+    </w:p>
+    <w:p>
+      <w:pPr>
+        <w:rPr>
+          <w:rFonts w:ascii="Calibri" w:hAnsi="Calibri" w:cs="Calibri"/>
+          <w:u w:val="single"/>
+        </w:rPr>
+      </w:pPr>
+      <w:r>
+        <w:rPr>
+          <w:rFonts w:ascii="Calibri" w:hAnsi="Calibri" w:cs="Calibri"/>
+          <w:u w:val="single"/>
+        </w:rPr>
+        <w:t>7. Overall Investigation Conclusion</w:t>
+      </w:r>
+    </w:p>
+    <w:p>
+      <w:pPr>
+        <w:rPr>
+          <w:rFonts w:ascii="Calibri" w:hAnsi="Calibri" w:cs="Calibri"/>
+        </w:rPr>
+      </w:pPr>
+      <w:r>
+        <w:rPr>
+          <w:rFonts w:ascii="Calibri" w:hAnsi="Calibri" w:cs="Calibri"/>
+        </w:rPr>
+        <w:t>Summarise the findings and their overall significance.</w:t>
+      </w:r>
+    </w:p>
+    <w:p>
+      <w:pPr>
+        <w:rPr>
+          <w:rFonts w:ascii="Calibri" w:hAnsi="Calibri" w:cs="Calibri"/>
+        </w:rPr>
+      </w:pPr>
+      <w:r>
+        <w:rPr>
+          <w:rFonts w:ascii="Calibri" w:hAnsi="Calibri" w:cs="Calibri"/>
+        </w:rPr>
+        <w:t>Clearly distinguish observed facts from inference and state the overall confidence in the investigation conclusions as low, medium, or high.</w:t>
+      </w:r>
+    </w:p>
+    <w:p>
+      <w:pPr>
+        <w:rPr>
+          <w:rFonts w:ascii="Calibri" w:hAnsi="Calibri" w:cs="Calibri"/>
+          <w:b/>
+          <w:bCs/>
+        </w:rPr>
+      </w:pPr>
+      <w:r>
+        <w:rPr>
+          <w:rFonts w:ascii="Calibri" w:hAnsi="Calibri" w:cs="Calibri"/>
+          <w:b/>
+          <w:bCs/>
+        </w:rPr>
+        <w:t>Requirements</w:t>
       </w:r>
     </w:p>
     <w:p>
       <w:pPr>
         <w:numPr>
           <w:ilvl w:val="0"/>
-          <w:numId w:val="1"/>
+          <w:numId w:val="2"/>
         </w:numPr>
-      </w:pPr>
-      <w:r>
+        <w:rPr>
+          <w:rFonts w:ascii="Calibri" w:hAnsi="Calibri" w:cs="Calibri"/>
+        </w:rPr>
+      </w:pPr>
+      <w:r>
+        <w:rPr>
+          <w:rFonts w:ascii="Calibri" w:hAnsi="Calibri" w:cs="Calibri"/>
+        </w:rPr>
         <w:t>Conduct the investigation autonomously without requesting additional guidance.</w:t>
       </w:r>
     </w:p>
@@ -123,38 +409,148 @@
       <w:pPr>
         <w:numPr>
           <w:ilvl w:val="0"/>
-          <w:numId w:val="1"/>
+          <w:numId w:val="2"/>
         </w:numPr>
-      </w:pPr>
-      <w:r>
-        <w:t xml:space="preserve">Base the investigation on the supplied Sysmon telemetry and </w:t>
-      </w:r>
-      <w:proofErr w:type="spellStart"/>
-      <w:r>
-        <w:t>Wazuh</w:t>
-      </w:r>
-      <w:proofErr w:type="spellEnd"/>
-      <w:r>
-        <w:t xml:space="preserve"> alerts.</w:t>
+        <w:rPr>
+          <w:rFonts w:ascii="Calibri" w:hAnsi="Calibri" w:cs="Calibri"/>
+        </w:rPr>
+      </w:pPr>
+      <w:r>
+        <w:rPr>
+          <w:rFonts w:ascii="Calibri" w:hAnsi="Calibri" w:cs="Calibri"/>
+        </w:rPr>
+        <w:t>Base the investigation on the supplied telemetry and alerts.</w:t>
       </w:r>
     </w:p>
     <w:p>
       <w:pPr>
         <w:numPr>
           <w:ilvl w:val="0"/>
-          <w:numId w:val="1"/>
+          <w:numId w:val="2"/>
         </w:numPr>
-      </w:pPr>
-      <w:r>
+        <w:rPr>
+          <w:rFonts w:ascii="Calibri" w:hAnsi="Calibri" w:cs="Calibri"/>
+        </w:rPr>
+      </w:pPr>
+      <w:r>
+        <w:rPr>
+          <w:rFonts w:ascii="Calibri" w:hAnsi="Calibri" w:cs="Calibri"/>
+        </w:rPr>
         <w:t>Independently determine which evidence is relevant and how it should be interpreted.</w:t>
       </w:r>
     </w:p>
     <w:p>
-      <w:r>
-        <w:t>Your final report should contain sufficient detail for the investigation to be assessed against the underlying telemetry.</w:t>
-      </w:r>
-    </w:p>
-    <w:p/>
+      <w:pPr>
+        <w:numPr>
+          <w:ilvl w:val="0"/>
+          <w:numId w:val="2"/>
+        </w:numPr>
+        <w:rPr>
+          <w:rFonts w:ascii="Calibri" w:hAnsi="Calibri" w:cs="Calibri"/>
+        </w:rPr>
+      </w:pPr>
+      <w:r>
+        <w:rPr>
+          <w:rFonts w:ascii="Calibri" w:hAnsi="Calibri" w:cs="Calibri"/>
+        </w:rPr>
+        <w:t>Independently determine whether observed events are related and explain relevant relationships where supported by the evidence.</w:t>
+      </w:r>
+    </w:p>
+    <w:p>
+      <w:pPr>
+        <w:numPr>
+          <w:ilvl w:val="0"/>
+          <w:numId w:val="2"/>
+        </w:numPr>
+        <w:rPr>
+          <w:rFonts w:ascii="Calibri" w:hAnsi="Calibri" w:cs="Calibri"/>
+        </w:rPr>
+      </w:pPr>
+      <w:r>
+        <w:rPr>
+          <w:rFonts w:ascii="Calibri" w:hAnsi="Calibri" w:cs="Calibri"/>
+        </w:rPr>
+        <w:t>Base conclusions on evidence contained within the supplied data.</w:t>
+      </w:r>
+    </w:p>
+    <w:p>
+      <w:pPr>
+        <w:numPr>
+          <w:ilvl w:val="0"/>
+          <w:numId w:val="2"/>
+        </w:numPr>
+        <w:rPr>
+          <w:rFonts w:ascii="Calibri" w:hAnsi="Calibri" w:cs="Calibri"/>
+        </w:rPr>
+      </w:pPr>
+      <w:r>
+        <w:rPr>
+          <w:rFonts w:ascii="Calibri" w:hAnsi="Calibri" w:cs="Calibri"/>
+        </w:rPr>
+        <w:t>Consider the isolated laboratory context when interpreting the observed activity.</w:t>
+      </w:r>
+    </w:p>
+    <w:p>
+      <w:pPr>
+        <w:numPr>
+          <w:ilvl w:val="0"/>
+          <w:numId w:val="2"/>
+        </w:numPr>
+        <w:rPr>
+          <w:rFonts w:ascii="Calibri" w:hAnsi="Calibri" w:cs="Calibri"/>
+        </w:rPr>
+      </w:pPr>
+      <w:r>
+        <w:rPr>
+          <w:rFonts w:ascii="Calibri" w:hAnsi="Calibri" w:cs="Calibri"/>
+        </w:rPr>
+        <w:t>Where an alert is present, assess the underlying evidence rather than assuming that the alert itself proves malicious activity.</w:t>
+      </w:r>
+    </w:p>
+    <w:p>
+      <w:pPr>
+        <w:numPr>
+          <w:ilvl w:val="0"/>
+          <w:numId w:val="2"/>
+        </w:numPr>
+        <w:rPr>
+          <w:rFonts w:ascii="Calibri" w:hAnsi="Calibri" w:cs="Calibri"/>
+        </w:rPr>
+      </w:pPr>
+      <w:r>
+        <w:rPr>
+          <w:rFonts w:ascii="Calibri" w:hAnsi="Calibri" w:cs="Calibri"/>
+        </w:rPr>
+        <w:t>Where evidence is excluded from the investigation as irrelevant or unrelated, explain this where it materially affects the interpretation.</w:t>
+      </w:r>
+    </w:p>
+    <w:p>
+      <w:pPr>
+        <w:rPr>
+          <w:rFonts w:ascii="Calibri" w:hAnsi="Calibri" w:cs="Calibri"/>
+        </w:rPr>
+      </w:pPr>
+      <w:r>
+        <w:rPr>
+          <w:rFonts w:ascii="Calibri" w:hAnsi="Calibri" w:cs="Calibri"/>
+        </w:rPr>
+        <w:t>Your final report should contain sufficient detail for the investigation to be independently assessed against the underlying telemetry.</w:t>
+      </w:r>
+    </w:p>
+    <w:p>
+      <w:pPr>
+        <w:rPr>
+          <w:rFonts w:ascii="Calibri" w:hAnsi="Calibri" w:cs="Calibri"/>
+        </w:rPr>
+      </w:pPr>
+    </w:p>
+    <w:p>
+      <w:pPr>
+        <w:rPr>
+          <w:rFonts w:ascii="Calibri" w:hAnsi="Calibri" w:cs="Calibri"/>
+        </w:rPr>
+      </w:pPr>
+    </w:p>
     <w:sectPr>
       <w:pgSz w:w="11906" w:h="16838"/>
       <w:pgMar w:top="1440" w:right="1440" w:bottom="1440" w:left="1440" w:header="708" w:footer="708" w:gutter="0"/>
@@ -316,8 +712,160 @@
       </w:rPr>
     </w:lvl>
   </w:abstractNum>
+  <w:abstractNum w:abstractNumId="1" w15:restartNumberingAfterBreak="0">
+    <w:nsid w:val="74DF524F"/>
+    <w:multiLevelType w:val="multilevel"/>
+    <w:tmpl w:val="B888D6BE"/>
+    <w:lvl w:ilvl="0">
+      <w:start w:val="1"/>
+      <w:numFmt w:val="bullet"/>
+      <w:lvlText w:val=""/>
+      <w:lvlJc w:val="left"/>
+      <w:pPr>
+        <w:tabs>
+          <w:tab w:val="num" w:pos="720"/>
+        </w:tabs>
+        <w:ind w:left="720" w:hanging="360"/>
+      </w:pPr>
+      <w:rPr>
+        <w:rFonts w:ascii="Symbol" w:hAnsi="Symbol" w:hint="default"/>
+        <w:sz w:val="20"/>
+      </w:rPr>
+    </w:lvl>
+    <w:lvl w:ilvl="1" w:tentative="1">
+      <w:start w:val="1"/>
+      <w:numFmt w:val="bullet"/>
+      <w:lvlText w:val="o"/>
+      <w:lvlJc w:val="left"/>
+      <w:pPr>
+        <w:tabs>
+          <w:tab w:val="num" w:pos="1440"/>
+        </w:tabs>
+        <w:ind w:left="1440" w:hanging="360"/>
+      </w:pPr>
+      <w:rPr>
+        <w:rFonts w:ascii="Courier New" w:hAnsi="Courier New" w:hint="default"/>
+        <w:sz w:val="20"/>
+      </w:rPr>
+    </w:lvl>
+    <w:lvl w:ilvl="2" w:tentative="1">
+      <w:start w:val="1"/>
+      <w:numFmt w:val="bullet"/>
+      <w:lvlText w:val=""/>
+      <w:lvlJc w:val="left"/>
+      <w:pPr>
+        <w:tabs>
+          <w:tab w:val="num" w:pos="2160"/>
+        </w:tabs>
+        <w:ind w:left="2160" w:hanging="360"/>
+      </w:pPr>
+      <w:rPr>
+        <w:rFonts w:ascii="Wingdings" w:hAnsi="Wingdings" w:hint="default"/>
+        <w:sz w:val="20"/>
+      </w:rPr>
+    </w:lvl>
+    <w:lvl w:ilvl="3" w:tentative="1">
+      <w:start w:val="1"/>
+      <w:numFmt w:val="bullet"/>
+      <w:lvlText w:val=""/>
+      <w:lvlJc w:val="left"/>
+      <w:pPr>
+        <w:tabs>
+          <w:tab w:val="num" w:pos="2880"/>
+        </w:tabs>
+        <w:ind w:left="2880" w:hanging="360"/>
+      </w:pPr>
+      <w:rPr>
+        <w:rFonts w:ascii="Wingdings" w:hAnsi="Wingdings" w:hint="default"/>
+        <w:sz w:val="20"/>
+      </w:rPr>
+    </w:lvl>
+    <w:lvl w:ilvl="4" w:tentative="1">
+      <w:start w:val="1"/>
+      <w:numFmt w:val="bullet"/>
+      <w:lvlText w:val=""/>
+      <w:lvlJc w:val="left"/>
+      <w:pPr>
+        <w:tabs>
+          <w:tab w:val="num" w:pos="3600"/>
+        </w:tabs>
+        <w:ind w:left="3600" w:hanging="360"/>
+      </w:pPr>
+      <w:rPr>
+        <w:rFonts w:ascii="Wingdings" w:hAnsi="Wingdings" w:hint="default"/>
+        <w:sz w:val="20"/>
+      </w:rPr>
+    </w:lvl>
+    <w:lvl w:ilvl="5" w:tentative="1">
+      <w:start w:val="1"/>
+      <w:numFmt w:val="bullet"/>
+      <w:lvlText w:val=""/>
+      <w:lvlJc w:val="left"/>
+      <w:pPr>
+        <w:tabs>
+          <w:tab w:val="num" w:pos="4320"/>
+        </w:tabs>
+        <w:ind w:left="4320" w:hanging="360"/>
+      </w:pPr>
+      <w:rPr>
+        <w:rFonts w:ascii="Wingdings" w:hAnsi="Wingdings" w:hint="default"/>
+        <w:sz w:val="20"/>
+      </w:rPr>
+    </w:lvl>
+    <w:lvl w:ilvl="6" w:tentative="1">
+      <w:start w:val="1"/>
+      <w:numFmt w:val="bullet"/>
+      <w:lvlText w:val=""/>
+      <w:lvlJc w:val="left"/>
+      <w:pPr>
+        <w:tabs>
+          <w:tab w:val="num" w:pos="5040"/>
+        </w:tabs>
+        <w:ind w:left="5040" w:hanging="360"/>
+      </w:pPr>
+      <w:rPr>
+        <w:rFonts w:ascii="Wingdings" w:hAnsi="Wingdings" w:hint="default"/>
+        <w:sz w:val="20"/>
+      </w:rPr>
+    </w:lvl>
+    <w:lvl w:ilvl="7" w:tentative="1">
+      <w:start w:val="1"/>
+      <w:numFmt w:val="bullet"/>
+      <w:lvlText w:val=""/>
+      <w:lvlJc w:val="left"/>
+      <w:pPr>
+        <w:tabs>
+          <w:tab w:val="num" w:pos="5760"/>
+        </w:tabs>
+        <w:ind w:left="5760" w:hanging="360"/>
+      </w:pPr>
+      <w:rPr>
+        <w:rFonts w:ascii="Wingdings" w:hAnsi="Wingdings" w:hint="default"/>
+        <w:sz w:val="20"/>
+      </w:rPr>
+    </w:lvl>
+    <w:lvl w:ilvl="8" w:tentative="1">
+      <w:start w:val="1"/>
+      <w:numFmt w:val="bullet"/>
+      <w:lvlText w:val=""/>
+      <w:lvlJc w:val="left"/>
+      <w:pPr>
+        <w:tabs>
+          <w:tab w:val="num" w:pos="6480"/>
+        </w:tabs>
+        <w:ind w:left="6480" w:hanging="360"/>
+      </w:pPr>
+      <w:rPr>
+        <w:rFonts w:ascii="Wingdings" w:hAnsi="Wingdings" w:hint="default"/>
+        <w:sz w:val="20"/>
+      </w:rPr>
+    </w:lvl>
+  </w:abstractNum>
   <w:num w:numId="1" w16cid:durableId="968628283">
     <w:abstractNumId w:val="0"/>
+  </w:num>
+  <w:num w:numId="2" w16cid:durableId="1626809910">
+    <w:abstractNumId w:val="1"/>
   </w:num>
 </w:numbering>
 </file>
@@ -722,6 +1270,7 @@
   <w:style w:type="paragraph" w:default="1" w:styleId="Normal">
     <w:name w:val="Normal"/>
     <w:qFormat/>
+    <w:rsid w:val="001D03AC"/>
   </w:style>
   <w:style w:type="paragraph" w:styleId="Heading1">
     <w:name w:val="heading 1"/>

</xml_diff>